<commit_message>
Edit docx, pdf, and md files
</commit_message>
<xml_diff>
--- a/A Stablecoin-backed Flatcoin.docx
+++ b/A Stablecoin-backed Flatcoin.docx
@@ -11,7 +11,33 @@
         <w:rPr>
           <w:sz w:val="40"/>
         </w:rPr>
-        <w:t xml:space="preserve">An Inflation-Resistant Stablecoin-backed Stablecoin </w:t>
+        <w:t xml:space="preserve">IRMA: </w:t>
+      </w:r>
+      <w:r>
+        <w:rPr>
+          <w:sz w:val="40"/>
+        </w:rPr>
+        <w:t xml:space="preserve">A Stablecoin-backed </w:t>
+      </w:r>
+      <w:proofErr w:type="spellStart"/>
+      <w:r>
+        <w:rPr>
+          <w:sz w:val="40"/>
+        </w:rPr>
+        <w:t>Flat</w:t>
+      </w:r>
+      <w:r>
+        <w:rPr>
+          <w:sz w:val="40"/>
+        </w:rPr>
+        <w:t>coin</w:t>
+      </w:r>
+      <w:proofErr w:type="spellEnd"/>
+      <w:r>
+        <w:rPr>
+          <w:sz w:val="40"/>
+        </w:rPr>
+        <w:t xml:space="preserve"> </w:t>
       </w:r>
     </w:p>
     <w:p>
@@ -45,14 +71,35 @@
           <w:color w:val="767676"/>
           <w:sz w:val="20"/>
         </w:rPr>
-        <w:t>November 23</w:t>
+        <w:t>July</w:t>
       </w:r>
       <w:r>
         <w:rPr>
           <w:color w:val="767676"/>
           <w:sz w:val="20"/>
         </w:rPr>
-        <w:t>, 2025</w:t>
+        <w:t xml:space="preserve"> </w:t>
+      </w:r>
+      <w:r>
+        <w:rPr>
+          <w:color w:val="767676"/>
+          <w:sz w:val="20"/>
+        </w:rPr>
+        <w:t>16</w:t>
+      </w:r>
+      <w:r>
+        <w:rPr>
+          <w:color w:val="767676"/>
+          <w:sz w:val="20"/>
+        </w:rPr>
+        <w:t>, 202</w:t>
+      </w:r>
+      <w:r>
+        <w:rPr>
+          <w:color w:val="767676"/>
+          <w:sz w:val="20"/>
+        </w:rPr>
+        <w:t>6</w:t>
       </w:r>
     </w:p>
     <w:p>
@@ -76,7 +123,7 @@
         <w:t>Version 0.</w:t>
       </w:r>
       <w:r>
-        <w:t>5</w:t>
+        <w:t>6</w:t>
       </w:r>
     </w:p>
     <w:p>
@@ -164,39 +211,15 @@
         <w:ind w:left="-5" w:right="13"/>
       </w:pPr>
       <w:r>
-        <w:t xml:space="preserve">Now imagine this: take all the technology and characteristics of BTC - the fact that it is weightless, frictionless, fungible - and introduce another token with these characteristics but without BTC's volatility, and you get something that can become an honest to goodness medium of exchange, i.e., money, that is superior to fiat money. This is what </w:t>
-      </w:r>
-      <w:proofErr w:type="gramStart"/>
-      <w:r>
-        <w:t>stablecoins</w:t>
-      </w:r>
-      <w:proofErr w:type="gramEnd"/>
-      <w:r>
-        <w:t xml:space="preserve"> are all about.  </w:t>
-      </w:r>
-    </w:p>
-    <w:p>
-      <w:pPr>
-        <w:ind w:left="-5" w:right="13"/>
-      </w:pPr>
-      <w:r>
-        <w:t xml:space="preserve">The downside is that fiat-backed </w:t>
-      </w:r>
-      <w:proofErr w:type="gramStart"/>
-      <w:r>
-        <w:t>stablecoins</w:t>
-      </w:r>
-      <w:proofErr w:type="gramEnd"/>
-      <w:r>
-        <w:t xml:space="preserve"> are centralized: each </w:t>
-      </w:r>
-      <w:proofErr w:type="gramStart"/>
-      <w:r>
-        <w:t>stablecoin</w:t>
-      </w:r>
-      <w:proofErr w:type="gramEnd"/>
-      <w:r>
-        <w:t xml:space="preserve"> is controlled by a single entity, its issuer. Stablecoins can also be censored because this is what compliance requires. However, these shortcomings can be fixed if the law allows. </w:t>
+        <w:t xml:space="preserve">Now imagine this: take all the technology and characteristics of BTC - the fact that it is weightless, frictionless, fungible - and introduce another token with these characteristics but without BTC's volatility, and you get something that can become an honest to goodness medium of exchange, i.e., money, that is superior to fiat money. This is what stablecoins are all about.  </w:t>
+      </w:r>
+    </w:p>
+    <w:p>
+      <w:pPr>
+        <w:ind w:left="-5" w:right="13"/>
+      </w:pPr>
+      <w:r>
+        <w:t xml:space="preserve">The downside is that fiat-backed stablecoins are centralized: each stablecoin is controlled by a single entity, its issuer. Stablecoins can also be censored because this is what compliance requires. However, these shortcomings can be fixed if the law allows. </w:t>
       </w:r>
     </w:p>
     <w:p>
@@ -220,23 +243,7 @@
         <w:ind w:left="-5" w:right="13"/>
       </w:pPr>
       <w:r>
-        <w:t xml:space="preserve">Just like paper money was backed by gold, the largest stablecoins today are backed by central bank money (fiat money). The promise behind these fiat-backed stablecoins is parity with fiat always (1 USDC will always be 1 USD, for example). What if the USD inflates? Fiat-backed </w:t>
-      </w:r>
-      <w:proofErr w:type="gramStart"/>
-      <w:r>
-        <w:t>stablecoins</w:t>
-      </w:r>
-      <w:proofErr w:type="gramEnd"/>
-      <w:r>
-        <w:t xml:space="preserve"> would inflate also because parity is the promise, and it would take a large amount of additional fiat backing (large amount of capital) to keep the value of a </w:t>
-      </w:r>
-      <w:proofErr w:type="gramStart"/>
-      <w:r>
-        <w:t>stablecoin</w:t>
-      </w:r>
-      <w:proofErr w:type="gramEnd"/>
-      <w:r>
-        <w:t xml:space="preserve"> with respect to its inflating backing. </w:t>
+        <w:t xml:space="preserve">Just like paper money was backed by gold, the largest stablecoins today are backed by central bank money (fiat money). The promise behind these fiat-backed stablecoins is parity with fiat always (1 USDC will always be 1 USD, for example). What if the USD inflates? Fiat-backed stablecoins would inflate also because parity is the promise, and it would take a large amount of additional fiat backing (large amount of capital) to keep the value of a stablecoin with respect to its inflating backing. </w:t>
       </w:r>
     </w:p>
     <w:p>
@@ -513,127 +520,143 @@
         <w:ind w:left="-5" w:right="13"/>
       </w:pPr>
       <w:r>
-        <w:t xml:space="preserve">Can we have a </w:t>
+        <w:t>Can we have a stablecoin that is inflation-resistant</w:t>
+      </w:r>
+      <w:r>
+        <w:t xml:space="preserve">, that is, a </w:t>
+      </w:r>
+      <w:proofErr w:type="spellStart"/>
+      <w:r>
+        <w:t>flatcoin</w:t>
+      </w:r>
+      <w:proofErr w:type="spellEnd"/>
+      <w:r>
+        <w:t xml:space="preserve">? </w:t>
       </w:r>
       <w:proofErr w:type="gramStart"/>
       <w:r>
-        <w:t>stablecoin</w:t>
+        <w:t>Yes</w:t>
       </w:r>
       <w:proofErr w:type="gramEnd"/>
       <w:r>
-        <w:t xml:space="preserve"> that is inflation-resistant? </w:t>
+        <w:t xml:space="preserve"> and this lite paper is about setting up a</w:t>
+      </w:r>
+      <w:r>
+        <w:t xml:space="preserve"> unique </w:t>
+      </w:r>
+      <w:proofErr w:type="spellStart"/>
+      <w:r>
+        <w:t>flat</w:t>
+      </w:r>
+      <w:r>
+        <w:t>coin</w:t>
+      </w:r>
+      <w:proofErr w:type="spellEnd"/>
+      <w:r>
+        <w:t xml:space="preserve">. The idea is very simple: make both issuance and redemption prices under absolute control of a smart contract and then calculate issuance price independently of redemption price. Issuance price can be greater than redemption price during times when fiat-backing is inflating. It is only when the fiat-backing is deflating (appreciating in value) that issuance price can be lower than redemption price. Issuance price can be determined by fiat inflation; however, redemption price is always equal to total fiat-backing divided by total amount of </w:t>
+      </w:r>
+      <w:proofErr w:type="spellStart"/>
+      <w:r>
+        <w:t>flat</w:t>
+      </w:r>
+      <w:r>
+        <w:t>coin</w:t>
+      </w:r>
+      <w:proofErr w:type="spellEnd"/>
+      <w:r>
+        <w:t xml:space="preserve"> in circulation. In other words, redemption price is always determined by total backing such that, even if all </w:t>
+      </w:r>
+      <w:proofErr w:type="spellStart"/>
+      <w:r>
+        <w:t>flat</w:t>
+      </w:r>
+      <w:r>
+        <w:t>coin</w:t>
+      </w:r>
+      <w:proofErr w:type="spellEnd"/>
+      <w:r>
+        <w:t xml:space="preserve"> holders </w:t>
       </w:r>
       <w:proofErr w:type="gramStart"/>
       <w:r>
-        <w:t>Yes</w:t>
+        <w:t>redeemed</w:t>
       </w:r>
       <w:proofErr w:type="gramEnd"/>
       <w:r>
-        <w:t xml:space="preserve"> and this lite paper is about setting up an inflation-resistant </w:t>
+        <w:t xml:space="preserve">, everyone can get back the equivalent amount of inflated fiat without causing a run. </w:t>
+      </w:r>
+    </w:p>
+    <w:p>
+      <w:pPr>
+        <w:ind w:left="-5" w:right="13"/>
+      </w:pPr>
+      <w:r>
+        <w:t xml:space="preserve">Issuance price Pm is higher than redemption price Pr in an amount proportional to runaway fiat inflation. The price difference does not accrue to issuer profit, however; rather, it accrues to the backing alone. As the total backing amount q increases more than total </w:t>
+      </w:r>
+      <w:proofErr w:type="spellStart"/>
+      <w:r>
+        <w:t>flat</w:t>
+      </w:r>
+      <w:r>
+        <w:t>coin</w:t>
+      </w:r>
+      <w:proofErr w:type="spellEnd"/>
+      <w:r>
+        <w:t xml:space="preserve"> in circulation Qs such that q &gt; Qs, so does redemption price increase because redemption price is simply equal to total backing divided by </w:t>
+      </w:r>
+      <w:proofErr w:type="spellStart"/>
+      <w:r>
+        <w:t>flat</w:t>
+      </w:r>
+      <w:r>
+        <w:t>coins</w:t>
+      </w:r>
+      <w:proofErr w:type="spellEnd"/>
+      <w:r>
+        <w:t xml:space="preserve"> in circulation. That is, </w:t>
+      </w:r>
+    </w:p>
+    <w:p>
+      <w:pPr>
+        <w:ind w:left="-5" w:right="13"/>
+      </w:pPr>
+      <w:r>
+        <w:t xml:space="preserve">Pr = q / Qs </w:t>
+      </w:r>
+    </w:p>
+    <w:p>
+      <w:pPr>
+        <w:ind w:left="-5" w:right="13"/>
+      </w:pPr>
+      <w:r>
+        <w:t xml:space="preserve">Below we continue with specifics as it relates to a particular </w:t>
+      </w:r>
+      <w:proofErr w:type="spellStart"/>
+      <w:r>
+        <w:t>flat</w:t>
+      </w:r>
+      <w:r>
+        <w:t>coin</w:t>
+      </w:r>
+      <w:proofErr w:type="spellEnd"/>
+      <w:r>
+        <w:t xml:space="preserve"> (Inflation Resistant Medium of Account - IRMA). IRMA is backed by USDC or USDT and not directly by USD because of liquidity mismatch between stablecoins and USD and because both USDC and USDT exist in Solana as SPL tokens and are therefore amenable to programming with IRMA. </w:t>
+      </w:r>
+    </w:p>
+    <w:p>
+      <w:pPr>
+        <w:ind w:left="-5" w:right="13"/>
+      </w:pPr>
+      <w:r>
+        <w:t>It may seem trivial, but the reason IRMA is named differently from other, USD backed stablecoins (which both incorporate "USD" in their symbols), is that, if USD inflates, it would be best for a new stablecoin not to be associated with USD. The non-USD derived symbol "IRMA" is an insurance against USD inflation. If IRMA inflates with USD, however, the symbol wouldn't mean anything. Clearly, we don't want IRMA to inflate with USD (</w:t>
       </w:r>
       <w:proofErr w:type="gramStart"/>
       <w:r>
-        <w:t>stablecoin</w:t>
+        <w:t>if and when</w:t>
       </w:r>
       <w:proofErr w:type="gramEnd"/>
       <w:r>
-        <w:t xml:space="preserve">. The idea is very simple: make both issuance and redemption prices under absolute control of a smart contract and then calculate issuance price independently of redemption price. Issuance price can be greater than redemption price during times when fiat-backing is inflating. It is only when the fiat-backing is deflating (appreciating in value) that issuance price can be lower than redemption price. Issuance price can be determined by fiat inflation; however, redemption price is always equal to total fiat-backing divided by total amount of stablecoin in circulation. In other words, redemption price is always determined by total backing such that, even if all </w:t>
-      </w:r>
-      <w:proofErr w:type="gramStart"/>
-      <w:r>
-        <w:t>stablecoin</w:t>
-      </w:r>
-      <w:proofErr w:type="gramEnd"/>
-      <w:r>
-        <w:t xml:space="preserve"> holders redeemed, everyone can get back the equivalent amount of inflated fiat without causing a run. </w:t>
-      </w:r>
-    </w:p>
-    <w:p>
-      <w:pPr>
-        <w:ind w:left="-5" w:right="13"/>
-      </w:pPr>
-      <w:r>
-        <w:t xml:space="preserve">Issuance price Pm is higher than redemption price Pr in an amount proportional to runaway fiat inflation. The price difference does not accrue to issuer profit, however; rather, it accrues to the backing alone. As the total backing amount q increases more than total </w:t>
-      </w:r>
-      <w:proofErr w:type="gramStart"/>
-      <w:r>
-        <w:t>stablecoin</w:t>
-      </w:r>
-      <w:proofErr w:type="gramEnd"/>
-      <w:r>
-        <w:t xml:space="preserve"> in circulation Qs such that q &gt; Qs, so does redemption price increase because redemption price is simply equal to total backing divided by inflation-resistant </w:t>
-      </w:r>
-      <w:proofErr w:type="gramStart"/>
-      <w:r>
-        <w:t>stablecoins</w:t>
-      </w:r>
-      <w:proofErr w:type="gramEnd"/>
-      <w:r>
-        <w:t xml:space="preserve"> in circulation. That is, </w:t>
-      </w:r>
-    </w:p>
-    <w:p>
-      <w:pPr>
-        <w:ind w:left="-5" w:right="13"/>
-      </w:pPr>
-      <w:r>
-        <w:t xml:space="preserve">Pr = q / Qs </w:t>
-      </w:r>
-    </w:p>
-    <w:p>
-      <w:pPr>
-        <w:ind w:left="-5" w:right="13"/>
-      </w:pPr>
-      <w:r>
-        <w:t xml:space="preserve">Below we continue with specifics as it relates to a particular inflation-resistant stablecoin (Inflation Resistant Medium of Account - IRMA). IRMA is backed by USDC or USDT and not directly by USD because of liquidity mismatch between stablecoins and USD and because both USDC and USDT exist in Solana as SPL tokens and are therefore amenable to programming with IRMA. </w:t>
-      </w:r>
-    </w:p>
-    <w:p>
-      <w:pPr>
-        <w:ind w:left="-5" w:right="13"/>
-      </w:pPr>
-      <w:r>
-        <w:t xml:space="preserve">It may seem trivial, but the reason IRMA is named differently from other, USD backed </w:t>
-      </w:r>
-      <w:proofErr w:type="gramStart"/>
-      <w:r>
-        <w:t>stablecoins</w:t>
-      </w:r>
-      <w:proofErr w:type="gramEnd"/>
-      <w:r>
-        <w:t xml:space="preserve"> (which both incorporate "USD" in their symbols), is that, if USD inflates, it would be best for a new </w:t>
-      </w:r>
-      <w:proofErr w:type="gramStart"/>
-      <w:r>
-        <w:t>stablecoin</w:t>
-      </w:r>
-      <w:proofErr w:type="gramEnd"/>
-      <w:r>
-        <w:t xml:space="preserve"> not to be associated with USD. The non-USD derived symbol "IRMA" is an insurance against USD inflation. If IRMA inflates with USD, however, the symbol wouldn't mean anything. Clearly, we don't </w:t>
-      </w:r>
-    </w:p>
-    <w:p>
-      <w:pPr>
-        <w:ind w:left="-5" w:right="13"/>
-      </w:pPr>
-      <w:r>
-        <w:t>want IRMA to inflate with USD (</w:t>
-      </w:r>
-      <w:proofErr w:type="gramStart"/>
-      <w:r>
-        <w:t>if and when</w:t>
-      </w:r>
-      <w:proofErr w:type="gramEnd"/>
-      <w:r>
-        <w:t xml:space="preserve"> it does). Let's now describe a game-</w:t>
-      </w:r>
-      <w:proofErr w:type="gramStart"/>
-      <w:r>
-        <w:t>theoretic</w:t>
-      </w:r>
-      <w:proofErr w:type="gramEnd"/>
-      <w:r>
-        <w:t xml:space="preserve"> system that can ensure this. </w:t>
+        <w:t xml:space="preserve"> it does). Let's now describe a game-theoretic system that can ensure this. </w:t>
       </w:r>
     </w:p>
     <w:p>
@@ -642,7 +665,6 @@
         <w:ind w:left="-4"/>
       </w:pPr>
       <w:r>
-        <w:lastRenderedPageBreak/>
         <w:t>The Ideal is Not Zero Inflation</w:t>
       </w:r>
       <w:r>
@@ -687,6 +709,7 @@
         <w:ind w:left="-5" w:right="13"/>
       </w:pPr>
       <w:r>
+        <w:lastRenderedPageBreak/>
         <w:t xml:space="preserve">At this stage, it would not be possible to measure inflation for any stablecoin directly because no stablecoin can yet compare with USD in terms of use as common medium of exchange. We think of stablecoins as merely substitutes for fiat money. As such, stablecoins use the value of fiat as reference. However, when fiat like USD inflates more than 2%, we would like our stablecoin to keep its value to within 2% inflation by increasing the amount of fiat backing - in this case USDC or USDT backing. </w:t>
       </w:r>
     </w:p>
@@ -697,13 +720,17 @@
       <w:r>
         <w:t xml:space="preserve">Keep the price on par with fiat (USD) if inflation is within </w:t>
       </w:r>
-      <w:proofErr w:type="gramStart"/>
-      <w:r>
-        <w:t>2%, but</w:t>
-      </w:r>
-      <w:proofErr w:type="gramEnd"/>
-      <w:r>
-        <w:t xml:space="preserve"> diverge (or "lose the peg") if USD inflation goes beyond 2%. This keeps the inflation-resistance mechanism simple.  </w:t>
+      <w:r>
+        <w:t>2% but</w:t>
+      </w:r>
+      <w:r>
+        <w:t xml:space="preserve"> diverge (or "lose the peg") if USD inflation goes beyond 2%. This keeps the </w:t>
+      </w:r>
+      <w:r>
+        <w:t>IRMA</w:t>
+      </w:r>
+      <w:r>
+        <w:t xml:space="preserve"> mechanism simple.  </w:t>
       </w:r>
     </w:p>
     <w:p>
@@ -713,19 +740,15 @@
       <w:r>
         <w:t xml:space="preserve">Note that there will be a time delay from the onset of above-2% inflation until IRMA catches up and increases its USD backing. This time delay will depend on the level of user participation in the </w:t>
       </w:r>
-      <w:proofErr w:type="gramStart"/>
-      <w:r>
-        <w:t>arbitrage .</w:t>
-      </w:r>
-      <w:proofErr w:type="gramEnd"/>
+      <w:r>
+        <w:t>arbitrage.</w:t>
+      </w:r>
       <w:r>
         <w:t xml:space="preserve"> This period of adjustment allows participants to make a profit </w:t>
       </w:r>
-      <w:proofErr w:type="gramStart"/>
-      <w:r>
-        <w:t>and also</w:t>
-      </w:r>
-      <w:proofErr w:type="gramEnd"/>
+      <w:r>
+        <w:t>and</w:t>
+      </w:r>
       <w:r>
         <w:t xml:space="preserve"> allows IRMA backing to increase such that q &gt; Qs. </w:t>
       </w:r>
@@ -761,11 +784,9 @@
       <w:r>
         <w:t xml:space="preserve">The price regulator that sets Pm and Pr will use </w:t>
       </w:r>
-      <w:proofErr w:type="gramStart"/>
-      <w:r>
-        <w:t>another,</w:t>
-      </w:r>
-      <w:proofErr w:type="gramEnd"/>
+      <w:r>
+        <w:t>another</w:t>
+      </w:r>
       <w:r>
         <w:t xml:space="preserve"> pre-existing Concentrated Liquidity Automated Market Maker (CLAMM) or a complex order-book DEX. We have looked at </w:t>
       </w:r>
@@ -784,12 +805,21 @@
         <w:ind w:left="-4" w:hanging="10"/>
       </w:pPr>
       <w:hyperlink r:id="rId7">
+        <w:proofErr w:type="spellStart"/>
         <w:r>
           <w:rPr>
             <w:color w:val="0000FF"/>
             <w:u w:val="single" w:color="0000FF"/>
           </w:rPr>
-          <w:t xml:space="preserve">OpenBook | </w:t>
+          <w:t>OpenBook</w:t>
+        </w:r>
+        <w:proofErr w:type="spellEnd"/>
+        <w:r>
+          <w:rPr>
+            <w:color w:val="0000FF"/>
+            <w:u w:val="single" w:color="0000FF"/>
+          </w:rPr>
+          <w:t xml:space="preserve"> | </w:t>
         </w:r>
         <w:proofErr w:type="spellStart"/>
         <w:r>
@@ -805,7 +835,23 @@
             <w:color w:val="0000FF"/>
             <w:u w:val="single" w:color="0000FF"/>
           </w:rPr>
-          <w:t xml:space="preserve"> - OpenBook Explorer</w:t>
+          <w:t xml:space="preserve"> - </w:t>
+        </w:r>
+        <w:proofErr w:type="spellStart"/>
+        <w:r>
+          <w:rPr>
+            <w:color w:val="0000FF"/>
+            <w:u w:val="single" w:color="0000FF"/>
+          </w:rPr>
+          <w:t>OpenBook</w:t>
+        </w:r>
+        <w:proofErr w:type="spellEnd"/>
+        <w:r>
+          <w:rPr>
+            <w:color w:val="0000FF"/>
+            <w:u w:val="single" w:color="0000FF"/>
+          </w:rPr>
+          <w:t xml:space="preserve"> Explorer</w:t>
         </w:r>
       </w:hyperlink>
       <w:hyperlink r:id="rId8">
@@ -825,7 +871,15 @@
       </w:r>
       <w:proofErr w:type="spellEnd"/>
       <w:r>
-        <w:t xml:space="preserve"> is based on OpenBook V2: </w:t>
+        <w:t xml:space="preserve"> is based on </w:t>
+      </w:r>
+      <w:proofErr w:type="spellStart"/>
+      <w:r>
+        <w:t>OpenBook</w:t>
+      </w:r>
+      <w:proofErr w:type="spellEnd"/>
+      <w:r>
+        <w:t xml:space="preserve"> V2: </w:t>
       </w:r>
       <w:hyperlink r:id="rId9">
         <w:proofErr w:type="spellStart"/>
@@ -870,37 +924,12 @@
         </w:r>
       </w:hyperlink>
       <w:hyperlink r:id="rId11">
-        <w:proofErr w:type="spellStart"/>
         <w:r>
           <w:rPr>
             <w:color w:val="0000FF"/>
             <w:u w:val="single" w:color="0000FF"/>
           </w:rPr>
-          <w:t>solana</w:t>
-        </w:r>
-        <w:proofErr w:type="spellEnd"/>
-        <w:r>
-          <w:rPr>
-            <w:color w:val="0000FF"/>
-            <w:u w:val="single" w:color="0000FF"/>
-          </w:rPr>
-          <w:t xml:space="preserve"> program and </w:t>
-        </w:r>
-        <w:proofErr w:type="spellStart"/>
-        <w:r>
-          <w:rPr>
-            <w:color w:val="0000FF"/>
-            <w:u w:val="single" w:color="0000FF"/>
-          </w:rPr>
-          <w:t>ts</w:t>
-        </w:r>
-        <w:proofErr w:type="spellEnd"/>
-        <w:r>
-          <w:rPr>
-            <w:color w:val="0000FF"/>
-            <w:u w:val="single" w:color="0000FF"/>
-          </w:rPr>
-          <w:t xml:space="preserve"> client (github.com)</w:t>
+          <w:t>solana program and ts client (github.com)</w:t>
         </w:r>
       </w:hyperlink>
       <w:hyperlink r:id="rId12">
@@ -938,12 +967,21 @@
         <w:ind w:left="-4" w:hanging="10"/>
       </w:pPr>
       <w:hyperlink r:id="rId15">
+        <w:proofErr w:type="spellStart"/>
         <w:r>
           <w:rPr>
             <w:color w:val="0000FF"/>
             <w:u w:val="single" w:color="0000FF"/>
           </w:rPr>
-          <w:t xml:space="preserve">OpenBook | </w:t>
+          <w:t>OpenBook</w:t>
+        </w:r>
+        <w:proofErr w:type="spellEnd"/>
+        <w:r>
+          <w:rPr>
+            <w:color w:val="0000FF"/>
+            <w:u w:val="single" w:color="0000FF"/>
+          </w:rPr>
+          <w:t xml:space="preserve"> | </w:t>
         </w:r>
         <w:proofErr w:type="spellStart"/>
         <w:r>
@@ -959,7 +997,23 @@
             <w:color w:val="0000FF"/>
             <w:u w:val="single" w:color="0000FF"/>
           </w:rPr>
-          <w:t xml:space="preserve"> - OpenBook Explorer</w:t>
+          <w:t xml:space="preserve"> - </w:t>
+        </w:r>
+        <w:proofErr w:type="spellStart"/>
+        <w:r>
+          <w:rPr>
+            <w:color w:val="0000FF"/>
+            <w:u w:val="single" w:color="0000FF"/>
+          </w:rPr>
+          <w:t>OpenBook</w:t>
+        </w:r>
+        <w:proofErr w:type="spellEnd"/>
+        <w:r>
+          <w:rPr>
+            <w:color w:val="0000FF"/>
+            <w:u w:val="single" w:color="0000FF"/>
+          </w:rPr>
+          <w:t xml:space="preserve"> Explorer</w:t>
         </w:r>
       </w:hyperlink>
       <w:hyperlink r:id="rId16">
@@ -973,7 +1027,15 @@
         <w:ind w:left="-5" w:right="13"/>
       </w:pPr>
       <w:r>
-        <w:t xml:space="preserve">We decided to interface directly with OpenBook V2 because it has an extensive pre-existing ecosystem of developers and front-end businesses. Plus, it has a large community in which technical support is available. </w:t>
+        <w:t xml:space="preserve">We decided to interface directly with </w:t>
+      </w:r>
+      <w:proofErr w:type="spellStart"/>
+      <w:r>
+        <w:t>OpenBook</w:t>
+      </w:r>
+      <w:proofErr w:type="spellEnd"/>
+      <w:r>
+        <w:t xml:space="preserve"> V2 because it has an extensive pre-existing ecosystem of developers and front-end businesses. Plus, it has a large community in which technical support is available. </w:t>
       </w:r>
       <w:r>
         <w:t xml:space="preserve">NOTE: Since the start of the Solana </w:t>
@@ -986,97 +1048,106 @@
       <w:r>
         <w:t xml:space="preserve"> Hackathon by Colosseum in </w:t>
       </w:r>
+      <w:r>
+        <w:t>October</w:t>
+      </w:r>
+      <w:r>
+        <w:t xml:space="preserve"> 2025, we have since switched to another DEX, the Meteora-DLMM (see https://meteora.ag).</w:t>
+      </w:r>
+    </w:p>
+    <w:p>
+      <w:pPr>
+        <w:spacing w:after="11"/>
+        <w:ind w:left="-5" w:right="13"/>
+      </w:pPr>
+      <w:r>
+        <w:t xml:space="preserve">We started development work in time for the Renaissance Hackathon, with IRMA paired with just </w:t>
+      </w:r>
+    </w:p>
+    <w:p>
+      <w:pPr>
+        <w:spacing w:after="11"/>
+        <w:ind w:left="-5" w:right="13"/>
+      </w:pPr>
+      <w:r>
+        <w:t xml:space="preserve">USDC. The issue rate and redeem rate should be fixed and slightly different, to start with maybe only </w:t>
+      </w:r>
+    </w:p>
+    <w:p>
+      <w:pPr>
+        <w:ind w:left="-5" w:right="13"/>
+      </w:pPr>
+      <w:r>
+        <w:t xml:space="preserve">0.01 different: issue rate = 1.01 USDC and redeem rate = 1.0000 USDC. This level of difference between Pm and Pr won't be noticeable for amounts below 1,000 IRMA. These two rates are Rock Stable rates, which is set by the autonomous price regulator. </w:t>
+      </w:r>
+    </w:p>
+    <w:p>
+      <w:pPr>
+        <w:ind w:left="-5" w:right="13"/>
+      </w:pPr>
+      <w:r>
+        <w:t xml:space="preserve">The issue rate and redeem rate are a big factor in determining the market rate, which is expected to be somewhere between Pr and Pm. The difference between Pr and Pm is used to earn more backing when USD and USDC inflate together: the issue rate can be raised while keeping the redeem rate the same, thereby increasing the USDC backing and the IRMA redeem rate. (The "redeem rate" being total backing divided by total IRMA in circulation.) The increase in USDC backing would be necessary if USD inflates (USDC is assumed to inflate with USD because USDC promises to be always 1 to 1 with USD). </w:t>
+      </w:r>
+    </w:p>
+    <w:p>
+      <w:pPr>
+        <w:ind w:left="-5" w:right="13"/>
+      </w:pPr>
+      <w:r>
+        <w:t xml:space="preserve">Note: in this discussion, the word "issuing" means the same as the informal word "minting". </w:t>
+      </w:r>
+    </w:p>
+    <w:p>
+      <w:pPr>
+        <w:ind w:left="-5" w:right="13"/>
+      </w:pPr>
+      <w:r>
+        <w:t xml:space="preserve">We are going to use a very simple mechanism to prevent IRMA from inflating with USD (and with USDC, its direct backing). At all times, when USD is inflating normally (2% or less), the IRMA </w:t>
+      </w:r>
       <w:proofErr w:type="gramStart"/>
       <w:r>
-        <w:t>October,</w:t>
+        <w:t>issuance price</w:t>
       </w:r>
       <w:proofErr w:type="gramEnd"/>
       <w:r>
-        <w:t xml:space="preserve"> 2025, we have since switched to another DEX, the Meteora-DLMM (see https://meteora.ag).</w:t>
-      </w:r>
-    </w:p>
-    <w:p>
-      <w:pPr>
-        <w:spacing w:after="11"/>
-        <w:ind w:left="-5" w:right="13"/>
-      </w:pPr>
-      <w:r>
-        <w:t xml:space="preserve">We started development work in time for the Renaissance Hackathon, with IRMA paired with just </w:t>
-      </w:r>
-    </w:p>
-    <w:p>
-      <w:pPr>
-        <w:spacing w:after="11"/>
-        <w:ind w:left="-5" w:right="13"/>
-      </w:pPr>
-      <w:r>
-        <w:t xml:space="preserve">USDC. The issue rate and redeem rate should be fixed and slightly different, to start with maybe only </w:t>
-      </w:r>
-    </w:p>
-    <w:p>
-      <w:pPr>
-        <w:ind w:left="-5" w:right="13"/>
-      </w:pPr>
-      <w:r>
-        <w:t xml:space="preserve">0.01 different: issue rate = 1.01 USDC and redeem rate = 1.0000 USDC. This level of difference between Pm and Pr won't be noticeable for amounts below 1,000 IRMA. These two rates are Rock Stable rates, which is set by the autonomous price regulator. </w:t>
-      </w:r>
-    </w:p>
-    <w:p>
-      <w:pPr>
-        <w:ind w:left="-5" w:right="13"/>
-      </w:pPr>
-      <w:r>
-        <w:t xml:space="preserve">The issue rate and redeem rate are a big factor in determining the market rate, which is expected to be somewhere between Pr and Pm. The difference between Pr and Pm is used to earn more backing when USD and USDC inflate together: the issue rate can be raised while keeping the redeem rate the same, thereby increasing the USDC backing and the IRMA redeem rate. (The "redeem rate" being total backing divided by total IRMA in circulation.) The increase in USDC backing would be necessary if USD inflates (USDC is assumed to inflate with USD because USDC promises to be always 1 to 1 with USD). </w:t>
-      </w:r>
-    </w:p>
-    <w:p>
-      <w:pPr>
-        <w:ind w:left="-5" w:right="13"/>
-      </w:pPr>
+        <w:t xml:space="preserve"> Pm </w:t>
+      </w:r>
       <w:r>
         <w:lastRenderedPageBreak/>
-        <w:t xml:space="preserve">Note: in this discussion, the word "issuing" means the same as the informal word "minting". </w:t>
-      </w:r>
-    </w:p>
-    <w:p>
-      <w:pPr>
-        <w:ind w:left="-5" w:right="13"/>
-      </w:pPr>
-      <w:r>
-        <w:t xml:space="preserve">We are going to use a very simple mechanism to prevent IRMA from inflating with USD (and with USDC, its direct backing). At all times, when USD is inflating normally (2% or less), the IRMA </w:t>
+        <w:t xml:space="preserve">with respect to USDC is slightly higher than our redemption price Pr, by 0.01 USDC. There is not much room for arbitrageurs to make money, except for very large deals. </w:t>
+      </w:r>
+    </w:p>
+    <w:p>
+      <w:pPr>
+        <w:spacing w:after="0"/>
+        <w:ind w:left="-5" w:right="13"/>
+      </w:pPr>
+      <w:r>
+        <w:t xml:space="preserve">To increase USD backing when USD is inflating above the normal 2%, the price auto-regulator will increase the minting price Pm of IRMA. The increase should be proportional to the increase in USD CPI as broadcast by an oracle. For this we need a reliable USD inflation oracle (see Balaji's challenge on this and </w:t>
+      </w:r>
+      <w:proofErr w:type="spellStart"/>
+      <w:r>
+        <w:t>Trueflation’s</w:t>
+      </w:r>
+      <w:proofErr w:type="spellEnd"/>
+      <w:r>
+        <w:t xml:space="preserve"> response). This would simultaneously reduce the demand for IRMA, especially because the redemption rate will not be raised similarly. This presents an opportunity to current IRMA holders and arbitrageurs. </w:t>
       </w:r>
       <w:proofErr w:type="gramStart"/>
       <w:r>
-        <w:t>issuance price</w:t>
+        <w:t>Current</w:t>
       </w:r>
       <w:proofErr w:type="gramEnd"/>
       <w:r>
-        <w:t xml:space="preserve"> Pm with respect to USDC is slightly higher than our redemption price Pr, by 0.01 USDC. There is not much room for arbitrageurs to make money, except for very large deals. </w:t>
-      </w:r>
-    </w:p>
-    <w:p>
-      <w:pPr>
-        <w:spacing w:after="0"/>
-        <w:ind w:left="-5" w:right="13"/>
-      </w:pPr>
-      <w:r>
-        <w:t xml:space="preserve">To increase USD backing when USD is inflating above the normal 2%, the price auto-regulator will increase the minting price Pm of IRMA. The increase should be proportional to the increase in USD CPI as broadcast by an oracle. For this we need a reliable USD inflation oracle (see Balaji's challenge on this and </w:t>
-      </w:r>
-      <w:proofErr w:type="spellStart"/>
-      <w:r>
-        <w:t>Trueflation’s</w:t>
-      </w:r>
-      <w:proofErr w:type="spellEnd"/>
-      <w:r>
-        <w:t xml:space="preserve"> response). This would simultaneously reduce the demand for IRMA, especially because the redemption rate will not be raised similarly. This presents an opportunity to current IRMA holders and arbitrageurs. </w:t>
+        <w:t xml:space="preserve"> IRMA </w:t>
       </w:r>
       <w:proofErr w:type="gramStart"/>
       <w:r>
-        <w:t>Current</w:t>
+        <w:t>holders</w:t>
       </w:r>
       <w:proofErr w:type="gramEnd"/>
       <w:r>
-        <w:t xml:space="preserve"> IRMA holders profit by offering IRMA at a lower price than the official issuance price; while arbitrageurs can buy IRMA higher than redemption price and sell IRMA at a lower price than issuance price and still make a profit. Participants can provide liquidity at these prices between Pr and Pm: </w:t>
+        <w:t xml:space="preserve"> profit by offering IRMA at a lower price than the official issuance price; while arbitrageurs can buy IRMA higher than redemption price and sell IRMA at a lower price than issuance price and still make a profit. Participants can provide liquidity at these prices between Pr and Pm: </w:t>
       </w:r>
     </w:p>
     <w:p>
@@ -1211,18 +1282,15 @@
         <w:ind w:right="126" w:hanging="360"/>
       </w:pPr>
       <w:r>
-        <w:t xml:space="preserve">If a trader currently holds USDC but wants to end up with IRMA, she just buys IRMA. The most important thing to note is that, by increasing the issuance price without increasing the redemption price, the IRMA auto-regulator contract can increase the USDC backing of IRMA such that USDC backing &gt; IRMA in circulation (or q &gt; Qs, where q = USDC backing and Qs = IRMA in circulation). Another important thing to note is that it would be very risky for </w:t>
-      </w:r>
+        <w:t xml:space="preserve">If a trader currently holds USDC but wants to end up with IRMA, she just buys IRMA. The most important thing to note is that, by increasing the issuance price without increasing the redemption price, the IRMA auto-regulator contract can increase the USDC backing of IRMA such that USDC backing &gt; IRMA in circulation (or q &gt; Qs, where q = USDC backing and Qs = IRMA in circulation). Another important thing to note is that it would be very risky for arbitrageurs to end up holding more backing USDC than when they started – arbitrageurs would always want to count their profits in IRMA rather than USDC or USD. </w:t>
+      </w:r>
+    </w:p>
+    <w:p>
+      <w:pPr>
+        <w:ind w:left="-5" w:right="13"/>
+      </w:pPr>
       <w:r>
         <w:lastRenderedPageBreak/>
-        <w:t xml:space="preserve">arbitrageurs to end up holding more backing USDC than when they started – arbitrageurs would always want to count their profits in IRMA rather than USDC or USD. </w:t>
-      </w:r>
-    </w:p>
-    <w:p>
-      <w:pPr>
-        <w:ind w:left="-5" w:right="13"/>
-      </w:pPr>
-      <w:r>
         <w:t xml:space="preserve">Nobody wants to hold an inflating currency, and by establishing that IRMA cannot go down in value along with the backing, we expect there to be increased demand even when the Issuance Price is increased. What better way to get rid of inflating USD than use it to buy </w:t>
       </w:r>
       <w:proofErr w:type="gramStart"/>
@@ -1239,23 +1307,7 @@
         <w:ind w:left="-5" w:right="13"/>
       </w:pPr>
       <w:r>
-        <w:t xml:space="preserve">The redemption price can be adjusted by the auto-regulating smart contract such that 1 IRMA = (q / Qs) USDC which is </w:t>
-      </w:r>
-      <w:proofErr w:type="gramStart"/>
-      <w:r>
-        <w:t>absolutely safe</w:t>
-      </w:r>
-      <w:proofErr w:type="gramEnd"/>
-      <w:r>
-        <w:t xml:space="preserve"> because, even if </w:t>
-      </w:r>
-      <w:proofErr w:type="gramStart"/>
-      <w:r>
-        <w:t>all of</w:t>
-      </w:r>
-      <w:proofErr w:type="gramEnd"/>
-      <w:r>
-        <w:t xml:space="preserve"> </w:t>
+        <w:t xml:space="preserve">The redemption price can be adjusted by the auto-regulating smart contract such that 1 IRMA = (q / Qs) USDC which is absolutely safe because, even if all of </w:t>
       </w:r>
       <w:proofErr w:type="gramStart"/>
       <w:r>
@@ -1415,8 +1467,11 @@
         <w:ind w:left="-5" w:right="13"/>
       </w:pPr>
       <w:r>
+        <w:t xml:space="preserve">The automatic pricing mechanism for IRMA prevents it from inflating with the backing by accumulating more backing. More backing, beyond 1 to 1 parity, is accumulated by raising the issuance price Pm </w:t>
+      </w:r>
+      <w:r>
         <w:lastRenderedPageBreak/>
-        <w:t xml:space="preserve">The automatic pricing mechanism for IRMA prevents it from inflating with the backing by accumulating more backing. More backing, beyond 1 to 1 parity, is accumulated by raising the issuance price Pm above Pr. The increase in backing would then raise Pr towards Pm. Once Pr approaches Pm, backing accumulation stops. </w:t>
+        <w:t xml:space="preserve">above Pr. The increase in backing would then raise Pr towards Pm. Once Pr approaches Pm, backing accumulation stops. </w:t>
       </w:r>
     </w:p>
     <w:p>
@@ -1593,27 +1648,24 @@
       </w:r>
       <w:proofErr w:type="gramEnd"/>
       <w:r>
-        <w:t xml:space="preserve"> would manage IRMA the same way the Fed is managing USD now, but </w:t>
-      </w:r>
+        <w:t xml:space="preserve"> would manage IRMA the same way the Fed is managing USD now, but with no other motivation than to keep it stable. Keeping IRMA stable </w:t>
+      </w:r>
+      <w:proofErr w:type="gramStart"/>
+      <w:r>
+        <w:t>increases</w:t>
+      </w:r>
+      <w:proofErr w:type="gramEnd"/>
+      <w:r>
+        <w:t xml:space="preserve"> the number of people who trust it, thereby increasing its market share. </w:t>
+      </w:r>
+    </w:p>
+    <w:p>
+      <w:pPr>
+        <w:spacing w:after="530"/>
+        <w:ind w:left="-5" w:right="13"/>
+      </w:pPr>
       <w:r>
         <w:lastRenderedPageBreak/>
-        <w:t xml:space="preserve">with no other motivation than to keep it stable. Keeping IRMA stable </w:t>
-      </w:r>
-      <w:proofErr w:type="gramStart"/>
-      <w:r>
-        <w:t>increases</w:t>
-      </w:r>
-      <w:proofErr w:type="gramEnd"/>
-      <w:r>
-        <w:t xml:space="preserve"> the number of people who trust it, thereby increasing its market share. </w:t>
-      </w:r>
-    </w:p>
-    <w:p>
-      <w:pPr>
-        <w:spacing w:after="530"/>
-        <w:ind w:left="-5" w:right="13"/>
-      </w:pPr>
-      <w:r>
         <w:t>Nevertheless, the incremental jump in Pm cannot be more than 0.1%</w:t>
       </w:r>
       <w:proofErr w:type="gramStart"/>
@@ -1761,62 +1813,47 @@
         <w:ind w:left="-5" w:right="13"/>
       </w:pPr>
       <w:r>
-        <w:t xml:space="preserve">If the Fed does not lose control of USD inflation, then all is well and good, and IRMA would remain just like any other </w:t>
-      </w:r>
-      <w:proofErr w:type="gramStart"/>
-      <w:r>
-        <w:t>stablecoin</w:t>
-      </w:r>
-      <w:proofErr w:type="gramEnd"/>
-      <w:r>
-        <w:t xml:space="preserve">. If the Fed loses control or in people's judgment would lose control, then other stablecoin issuers would come out of the woodwork adopting the same algorithm as this IRMA algorithm. </w:t>
-      </w:r>
-    </w:p>
-    <w:p>
-      <w:pPr>
-        <w:ind w:left="-5" w:right="13"/>
-      </w:pPr>
+        <w:t xml:space="preserve">If the Fed does not lose control of USD inflation, then all is well and good, and IRMA would remain just like any other stablecoin. If the Fed loses control or in people's judgment would lose control, then other stablecoin issuers would come out of the woodwork adopting the same algorithm as this IRMA algorithm. </w:t>
+      </w:r>
+    </w:p>
+    <w:p>
+      <w:pPr>
+        <w:ind w:left="-5" w:right="13"/>
+      </w:pPr>
+      <w:r>
+        <w:t xml:space="preserve">If the Fed loses control, the backing of IRMA and other similar stablecoins would not be so useful, but by then this new crop of stablecoins would have established their own network effects. Each such stablecoin would then become private fiat </w:t>
+      </w:r>
+      <w:proofErr w:type="spellStart"/>
+      <w:r>
+        <w:t>flatcoin</w:t>
+      </w:r>
+      <w:proofErr w:type="spellEnd"/>
+      <w:r>
+        <w:t xml:space="preserve">, able to earn seigniorage profits, competing for </w:t>
+      </w:r>
       <w:r>
         <w:lastRenderedPageBreak/>
-        <w:t xml:space="preserve">If the Fed loses control, the backing of IRMA and other similar </w:t>
-      </w:r>
-      <w:proofErr w:type="gramStart"/>
-      <w:r>
-        <w:t>stablecoins</w:t>
-      </w:r>
-      <w:proofErr w:type="gramEnd"/>
-      <w:r>
-        <w:t xml:space="preserve"> would not be so useful, but by then this new crop of </w:t>
-      </w:r>
-      <w:proofErr w:type="gramStart"/>
-      <w:r>
-        <w:t>stablecoins</w:t>
-      </w:r>
-      <w:proofErr w:type="gramEnd"/>
-      <w:r>
-        <w:t xml:space="preserve"> would have established their own network effects. Each such </w:t>
-      </w:r>
-      <w:proofErr w:type="gramStart"/>
-      <w:r>
-        <w:t>stablecoin</w:t>
-      </w:r>
-      <w:proofErr w:type="gramEnd"/>
-      <w:r>
-        <w:t xml:space="preserve"> would then become private fiat money, able to earn seigniorage profits, competing for market share in which the most stable coin wins. Only a few private </w:t>
-      </w:r>
-      <w:proofErr w:type="gramStart"/>
-      <w:r>
-        <w:t>stablecoins</w:t>
-      </w:r>
-      <w:proofErr w:type="gramEnd"/>
+        <w:t xml:space="preserve">market share in which the most stable coin wins. Only a few private </w:t>
+      </w:r>
+      <w:proofErr w:type="spellStart"/>
+      <w:r>
+        <w:t>flat</w:t>
+      </w:r>
+      <w:r>
+        <w:t>coins</w:t>
+      </w:r>
+      <w:proofErr w:type="spellEnd"/>
       <w:r>
         <w:t xml:space="preserve"> would win in the end. Given the size of the market, it is most unlikely that only a single </w:t>
       </w:r>
-      <w:proofErr w:type="gramStart"/>
-      <w:r>
-        <w:t>stablecoin</w:t>
-      </w:r>
-      <w:proofErr w:type="gramEnd"/>
+      <w:proofErr w:type="spellStart"/>
+      <w:r>
+        <w:t>flat</w:t>
+      </w:r>
+      <w:r>
+        <w:t>coin</w:t>
+      </w:r>
+      <w:proofErr w:type="spellEnd"/>
       <w:r>
         <w:t xml:space="preserve"> would remain; using game theory, we should be able to prove that this is not a winner-take-all kind of business.  </w:t>
       </w:r>
@@ -1832,102 +1869,108 @@
         </w:rPr>
         <w:t xml:space="preserve">What Would It </w:t>
       </w:r>
+      <w:r>
+        <w:rPr>
+          <w:b/>
+        </w:rPr>
+        <w:t>Be</w:t>
+      </w:r>
+      <w:r>
+        <w:rPr>
+          <w:b/>
+        </w:rPr>
+        <w:t xml:space="preserve"> Like for Users?</w:t>
+      </w:r>
+      <w:r>
+        <w:t xml:space="preserve"> </w:t>
+      </w:r>
+    </w:p>
+    <w:p>
+      <w:pPr>
+        <w:ind w:left="-5" w:right="13"/>
+      </w:pPr>
+      <w:r>
+        <w:t xml:space="preserve">The experience of the end-user shouldn't be bad either. We know how </w:t>
+      </w:r>
+      <w:proofErr w:type="spellStart"/>
+      <w:r>
+        <w:t>facebook</w:t>
+      </w:r>
+      <w:proofErr w:type="spellEnd"/>
+      <w:r>
+        <w:t xml:space="preserve"> dominates: it’s because their currency is user data, which cannot be shared with other social media (not even with the users themselves). In the money world, exclusivity of currency is not going to be an advantage. Money needs to go from one user to another user (even a user holding a different </w:t>
+      </w:r>
+      <w:proofErr w:type="spellStart"/>
+      <w:r>
+        <w:t>flat</w:t>
+      </w:r>
+      <w:r>
+        <w:t>coin</w:t>
+      </w:r>
+      <w:proofErr w:type="spellEnd"/>
+      <w:r>
+        <w:t xml:space="preserve">). If you hold </w:t>
+      </w:r>
+      <w:proofErr w:type="spellStart"/>
+      <w:r>
+        <w:t>flat</w:t>
+      </w:r>
+      <w:r>
+        <w:t>coin</w:t>
+      </w:r>
+      <w:proofErr w:type="spellEnd"/>
+      <w:r>
+        <w:t xml:space="preserve"> x and the </w:t>
+      </w:r>
       <w:proofErr w:type="gramStart"/>
       <w:r>
-        <w:rPr>
-          <w:b/>
-        </w:rPr>
-        <w:t>be</w:t>
+        <w:t>grocery</w:t>
       </w:r>
       <w:proofErr w:type="gramEnd"/>
       <w:r>
-        <w:rPr>
-          <w:b/>
-        </w:rPr>
-        <w:t xml:space="preserve"> Like for Users?</w:t>
+        <w:t xml:space="preserve"> you want to buy goods from only accepts </w:t>
+      </w:r>
+      <w:proofErr w:type="spellStart"/>
+      <w:r>
+        <w:t>flat</w:t>
+      </w:r>
+      <w:r>
+        <w:t>coin</w:t>
+      </w:r>
+      <w:proofErr w:type="spellEnd"/>
+      <w:r>
+        <w:t xml:space="preserve"> y, obviously there is a problem. But even in previous chapters of the history of money in which private banks issued notes (currency), these private banks made sure that they accept other banks' notes for redemption. Any bank that rejected any</w:t>
       </w:r>
       <w:r>
         <w:t xml:space="preserve"> </w:t>
       </w:r>
-    </w:p>
-    <w:p>
-      <w:pPr>
-        <w:ind w:left="-5" w:right="13"/>
-      </w:pPr>
-      <w:r>
-        <w:t xml:space="preserve">The experience of the end-user shouldn't be bad either. We know how </w:t>
+      <w:r>
+        <w:t xml:space="preserve">other banks' </w:t>
+      </w:r>
+      <w:proofErr w:type="gramStart"/>
+      <w:r>
+        <w:t>note</w:t>
+      </w:r>
+      <w:proofErr w:type="gramEnd"/>
+      <w:r>
+        <w:t xml:space="preserve"> became isolated until all its users got rid of this bank's notes. In the money competition, the last thing you want is to be isolated. To increase market share, you </w:t>
+      </w:r>
+      <w:r>
+        <w:t>must</w:t>
+      </w:r>
+      <w:r>
+        <w:t xml:space="preserve"> accept all other banks' notes. The same thing will happen among competing </w:t>
       </w:r>
       <w:proofErr w:type="spellStart"/>
       <w:r>
-        <w:t>facebook</w:t>
+        <w:t>flat</w:t>
+      </w:r>
+      <w:r>
+        <w:t>coin</w:t>
       </w:r>
       <w:proofErr w:type="spellEnd"/>
       <w:r>
-        <w:t xml:space="preserve"> dominates: it’s because their currency is user data, which cannot be shared with other social media (not even with the users themselves). In the money world, exclusivity of currency is not going to be an advantage. Money needs to go from one user to another user (even a user holding a different </w:t>
-      </w:r>
-      <w:proofErr w:type="gramStart"/>
-      <w:r>
-        <w:t>stablecoin</w:t>
-      </w:r>
-      <w:proofErr w:type="gramEnd"/>
-      <w:r>
-        <w:t xml:space="preserve">). If you hold </w:t>
-      </w:r>
-      <w:proofErr w:type="gramStart"/>
-      <w:r>
-        <w:t>stablecoin</w:t>
-      </w:r>
-      <w:proofErr w:type="gramEnd"/>
-      <w:r>
-        <w:t xml:space="preserve"> x and the </w:t>
-      </w:r>
-      <w:proofErr w:type="gramStart"/>
-      <w:r>
-        <w:t>grocery</w:t>
-      </w:r>
-      <w:proofErr w:type="gramEnd"/>
-      <w:r>
-        <w:t xml:space="preserve"> you want to buy goods from only accepts </w:t>
-      </w:r>
-      <w:proofErr w:type="gramStart"/>
-      <w:r>
-        <w:t>stablecoin</w:t>
-      </w:r>
-      <w:proofErr w:type="gramEnd"/>
-      <w:r>
-        <w:t xml:space="preserve"> y, obviously there is a problem. But even in previous chapters of the history of money in which private banks issued notes (currency), these private banks made sure that they accept other banks' notes for redemption. Any bank that rejected any </w:t>
-      </w:r>
-    </w:p>
-    <w:p>
-      <w:pPr>
-        <w:ind w:left="-5" w:right="13"/>
-      </w:pPr>
-      <w:r>
-        <w:t xml:space="preserve">other banks' </w:t>
-      </w:r>
-      <w:proofErr w:type="gramStart"/>
-      <w:r>
-        <w:t>note</w:t>
-      </w:r>
-      <w:proofErr w:type="gramEnd"/>
-      <w:r>
-        <w:t xml:space="preserve"> became isolated until all its users got rid of this bank's notes. In the money competition, the last thing you want is to be isolated. To increase market share, you </w:t>
-      </w:r>
-      <w:proofErr w:type="gramStart"/>
-      <w:r>
-        <w:t>have to</w:t>
-      </w:r>
-      <w:proofErr w:type="gramEnd"/>
-      <w:r>
-        <w:t xml:space="preserve"> accept all other banks' notes. The same thing will happen among competing stablecoin </w:t>
-      </w:r>
-      <w:proofErr w:type="gramStart"/>
-      <w:r>
-        <w:t>issuers</w:t>
-      </w:r>
-      <w:proofErr w:type="gramEnd"/>
-      <w:r>
-        <w:t xml:space="preserve">. When you go to that </w:t>
+        <w:t xml:space="preserve"> issuers. When you go to that </w:t>
       </w:r>
       <w:proofErr w:type="gramStart"/>
       <w:r>
@@ -2015,40 +2058,24 @@
         <w:ind w:left="-5" w:right="13"/>
       </w:pPr>
       <w:r>
+        <w:t>"</w:t>
+      </w:r>
+      <w:proofErr w:type="gramStart"/>
+      <w:r>
+        <w:t>portfolio</w:t>
+      </w:r>
+      <w:proofErr w:type="gramEnd"/>
+      <w:r>
+        <w:t xml:space="preserve"> rebalancing". The rebalancing should happen without doing anything on our part. Arbitrageurs will take advantage of the imbalance. It's like dealing with the situation of two exchanges not having the same price for a commodity that is sold in both exchanges. Arbitrageurs would immediately sense an opportunity and take advantage of the imbalance. </w:t>
+      </w:r>
+    </w:p>
+    <w:p>
+      <w:pPr>
+        <w:ind w:left="-5" w:right="13"/>
+      </w:pPr>
+      <w:r>
         <w:lastRenderedPageBreak/>
-        <w:t>"</w:t>
-      </w:r>
-      <w:proofErr w:type="gramStart"/>
-      <w:r>
-        <w:t>portfolio</w:t>
-      </w:r>
-      <w:proofErr w:type="gramEnd"/>
-      <w:r>
-        <w:t xml:space="preserve"> rebalancing". The rebalancing should happen without doing anything on our part. Arbitrageurs will take advantage of the imbalance. It's like dealing with the situation of two exchanges not having the same price for a commodity that is sold in both exchanges. Arbitrageurs would immediately sense an opportunity and take advantage of the imbalance. </w:t>
-      </w:r>
-    </w:p>
-    <w:p>
-      <w:pPr>
-        <w:ind w:left="-5" w:right="13"/>
-      </w:pPr>
-      <w:r>
-        <w:t xml:space="preserve">With USDC and USDT, the arbitrageurs won't have to deal with two exchanges: they can sense the imbalance in the same DEX OpenBook V2 market for IRMA. Arbitrageur activity would rebalance the two backing </w:t>
-      </w:r>
-      <w:proofErr w:type="gramStart"/>
-      <w:r>
-        <w:t>stablecoins</w:t>
-      </w:r>
-      <w:proofErr w:type="gramEnd"/>
-      <w:r>
-        <w:t xml:space="preserve">. Let's take the example of that arbitrageur buying a million IRMA with her USDC and then redeeming IRMA for USDT. The reason she would do this is most probably because USDT price is going up with respect to USD, while USDC is not. If this price difference is not yet reflected in Pr and Pm for both </w:t>
-      </w:r>
-      <w:proofErr w:type="gramStart"/>
-      <w:r>
-        <w:t>stablecoins</w:t>
-      </w:r>
-      <w:proofErr w:type="gramEnd"/>
-      <w:r>
-        <w:t xml:space="preserve">, then the arbitrageur would be making a profit by her action. From the standpoint of IRMA, the action reduces USDT backing and that's fine, because USDT value is now higher than USDC. The risk for a run either on the USDC side or USDT side does not increase by arbitrage. </w:t>
+        <w:t xml:space="preserve">With USDC and USDT, the arbitrageurs won't have to deal with two exchanges: they can sense the imbalance in the same DEX OpenBook V2 market for IRMA. Arbitrageur activity would rebalance the two backing stablecoins. Let's take the example of that arbitrageur buying a million IRMA with her USDC and then redeeming IRMA for USDT. The reason she would do this is most probably because USDT price is going up with respect to USD, while USDC is not. If this price difference is not yet reflected in Pr and Pm for both stablecoins, then the arbitrageur would be making a profit by her action. From the standpoint of IRMA, the action reduces USDT backing and that's fine, because USDT value is now higher than USDC. The risk for a run either on the USDC side or USDT side does not increase by arbitrage. </w:t>
       </w:r>
     </w:p>
     <w:p>
@@ -2663,21 +2690,7 @@
         <w:rPr>
           <w:bCs/>
         </w:rPr>
-        <w:t xml:space="preserve">As can be seen in the above summation equalities, it really does not matter which reserve </w:t>
-      </w:r>
-      <w:proofErr w:type="gramStart"/>
-      <w:r>
-        <w:rPr>
-          <w:bCs/>
-        </w:rPr>
-        <w:t>stablecoin</w:t>
-      </w:r>
-      <w:proofErr w:type="gramEnd"/>
-      <w:r>
-        <w:rPr>
-          <w:bCs/>
-        </w:rPr>
-        <w:t xml:space="preserve"> a burn is assigned to. What is important is that the total remaining IRMA in circulation sums up in value equal to the sum of all the values of all reserves. The quantity of IRMA-sub-</w:t>
+        <w:t>As can be seen in the above summation equalities, it really does not matter which reserve stablecoin a burn is assigned to. What is important is that the total remaining IRMA in circulation sums up in value equal to the sum of all the values of all reserves. The quantity of IRMA-sub-</w:t>
       </w:r>
       <w:proofErr w:type="spellStart"/>
       <w:r>

</xml_diff>